<commit_message>
Add iOS subscription guide section
</commit_message>
<xml_diff>
--- a/原始教程.docx
+++ b/原始教程.docx
@@ -5,6 +5,9 @@
     <w:p>
       <w:pPr>
         <w:pStyle w:val="a3"/>
+        <w:rPr>
+          <w:rFonts w:hint="eastAsia"/>
+        </w:rPr>
       </w:pPr>
       <w:r>
         <w:rPr>
@@ -17,6 +20,7 @@
       <w:pPr>
         <w:rPr>
           <w:rStyle w:val="af1"/>
+          <w:rFonts w:hint="eastAsia"/>
         </w:rPr>
       </w:pPr>
       <w:r>
@@ -78,41 +82,57 @@
     </w:p>
     <w:p>
       <w:pPr>
-        <w:rPr>
-          <w:rFonts w:hint="eastAsia"/>
-        </w:rPr>
-      </w:pPr>
-      <w:r>
-        <w:rPr>
-          <w:rFonts w:hint="eastAsia"/>
-        </w:rPr>
-        <w:t>只是使用chat类免费模型的话整个过程</w:t>
-      </w:r>
-      <w:r>
-        <w:rPr>
-          <w:rFonts w:hint="eastAsia"/>
-        </w:rPr>
-        <w:t>只有你订阅梯子需要费用，不过也很便宜，普通家庭的孩子也能轻松拿下</w:t>
-      </w:r>
-      <w:r>
-        <w:rPr>
-          <w:rFonts w:hint="eastAsia"/>
-        </w:rPr>
-        <w:t>，</w:t>
-      </w:r>
-      <w:r>
-        <w:rPr>
-          <w:rFonts w:hint="eastAsia"/>
-        </w:rPr>
-        <w:t>而且手机与电脑可以使用同一个订阅，</w:t>
-      </w:r>
-      <w:r>
         <w:rPr>
           <w:rFonts w:hint="eastAsia"/>
           <w:sz w:val="40"/>
           <w:szCs w:val="44"/>
         </w:rPr>
+      </w:pPr>
+      <w:r>
+        <w:rPr>
+          <w:rFonts w:hint="eastAsia"/>
+        </w:rPr>
+        <w:t>只是使用chat类免费模型的话整个过程</w:t>
+      </w:r>
+      <w:r>
+        <w:rPr>
+          <w:rFonts w:hint="eastAsia"/>
+        </w:rPr>
+        <w:t>只有你订阅梯子需要费用，不过也很便宜，普通家庭的孩子也能轻松拿下</w:t>
+      </w:r>
+      <w:r>
+        <w:rPr>
+          <w:rFonts w:hint="eastAsia"/>
+        </w:rPr>
+        <w:t>，</w:t>
+      </w:r>
+      <w:r>
+        <w:rPr>
+          <w:rFonts w:hint="eastAsia"/>
+        </w:rPr>
+        <w:t>而且手机与电脑可以使用同一个订阅，</w:t>
+      </w:r>
+      <w:r>
+        <w:rPr>
+          <w:rFonts w:hint="eastAsia"/>
+          <w:sz w:val="40"/>
+          <w:szCs w:val="44"/>
+        </w:rPr>
         <w:t>全程无痛</w:t>
+      </w:r>
+    </w:p>
+    <w:p>
+      <w:pPr>
+        <w:rPr>
+          <w:rFonts w:hint="eastAsia"/>
+        </w:rPr>
+      </w:pPr>
+      <w:r>
+        <w:rPr>
+          <w:rFonts w:hint="eastAsia"/>
+          <w:highlight w:val="yellow"/>
+        </w:rPr>
+        <w:t>如果想要订阅上国外ai可以看教程最后</w:t>
       </w:r>
     </w:p>
     <w:p>
@@ -245,6 +265,11 @@
       </w:r>
     </w:p>
     <w:p>
+      <w:pPr>
+        <w:rPr>
+          <w:rFonts w:hint="eastAsia"/>
+        </w:rPr>
+      </w:pPr>
       <w:r>
         <w:rPr>
           <w:rFonts w:hint="eastAsia"/>
@@ -856,6 +881,11 @@
       </w:pPr>
     </w:p>
     <w:p>
+      <w:pPr>
+        <w:rPr>
+          <w:rFonts w:hint="eastAsia"/>
+        </w:rPr>
+      </w:pPr>
       <w:r>
         <w:rPr>
           <w:rFonts w:hint="eastAsia"/>
@@ -990,6 +1020,9 @@
     <w:p>
       <w:pPr>
         <w:pStyle w:val="2"/>
+        <w:rPr>
+          <w:rFonts w:hint="eastAsia"/>
+        </w:rPr>
       </w:pPr>
       <w:proofErr w:type="spellStart"/>
       <w:r>
@@ -1008,6 +1041,11 @@
       </w:r>
     </w:p>
     <w:p>
+      <w:pPr>
+        <w:rPr>
+          <w:rFonts w:hint="eastAsia"/>
+        </w:rPr>
+      </w:pPr>
       <w:r>
         <w:rPr>
           <w:rFonts w:hint="eastAsia"/>
@@ -1036,6 +1074,9 @@
         </w:rPr>
       </w:pPr>
       <w:r>
+        <w:rPr>
+          <w:noProof/>
+        </w:rPr>
         <w:drawing>
           <wp:inline distT="0" distB="0" distL="0" distR="0" wp14:anchorId="5D4BA97B" wp14:editId="3AB1BA56">
             <wp:extent cx="3686689" cy="1371791"/>
@@ -1076,6 +1117,9 @@
     <w:p>
       <w:pPr>
         <w:pStyle w:val="1"/>
+        <w:rPr>
+          <w:rFonts w:hint="eastAsia"/>
+        </w:rPr>
       </w:pPr>
       <w:r>
         <w:rPr>
@@ -1148,6 +1192,11 @@
       </w:pPr>
     </w:p>
     <w:p>
+      <w:pPr>
+        <w:rPr>
+          <w:rFonts w:hint="eastAsia"/>
+        </w:rPr>
+      </w:pPr>
       <w:r>
         <w:rPr>
           <w:rFonts w:hint="eastAsia"/>
@@ -1183,8 +1232,19 @@
         <w:t>这个网站，地区选择美国，电话还是中国地区+86就可以，然后邮箱用一个没有注册过苹果id账户的邮箱</w:t>
       </w:r>
     </w:p>
-    <w:p/>
-    <w:p>
+    <w:p>
+      <w:pPr>
+        <w:rPr>
+          <w:rFonts w:hint="eastAsia"/>
+        </w:rPr>
+      </w:pPr>
+    </w:p>
+    <w:p>
+      <w:pPr>
+        <w:rPr>
+          <w:rFonts w:hint="eastAsia"/>
+        </w:rPr>
+      </w:pPr>
       <w:r>
         <w:rPr>
           <w:rFonts w:hint="eastAsia"/>
@@ -1193,6 +1253,11 @@
       </w:r>
     </w:p>
     <w:p>
+      <w:pPr>
+        <w:rPr>
+          <w:rFonts w:hint="eastAsia"/>
+        </w:rPr>
+      </w:pPr>
       <w:r>
         <w:t>街道地址</w:t>
       </w:r>
@@ -1212,6 +1277,11 @@
       </w:r>
     </w:p>
     <w:p>
+      <w:pPr>
+        <w:rPr>
+          <w:rFonts w:hint="eastAsia"/>
+        </w:rPr>
+      </w:pPr>
       <w:r>
         <w:t>街道地址</w:t>
       </w:r>
@@ -1220,13 +1290,7 @@
         <w:rPr>
           <w:rFonts w:hint="eastAsia"/>
         </w:rPr>
-        <w:t>：</w:t>
-      </w:r>
-      <w:r>
-        <w:rPr>
-          <w:rFonts w:hint="eastAsia"/>
-        </w:rPr>
-        <w:t xml:space="preserve">     </w:t>
+        <w:t xml:space="preserve">：     </w:t>
       </w:r>
       <w:r>
         <w:t xml:space="preserve">123 </w:t>
@@ -1237,6 +1301,11 @@
       </w:r>
     </w:p>
     <w:p>
+      <w:pPr>
+        <w:rPr>
+          <w:rFonts w:hint="eastAsia"/>
+        </w:rPr>
+      </w:pPr>
       <w:r>
         <w:rPr>
           <w:rFonts w:hint="eastAsia"/>
@@ -1248,6 +1317,11 @@
       </w:r>
     </w:p>
     <w:p>
+      <w:pPr>
+        <w:rPr>
+          <w:rFonts w:hint="eastAsia"/>
+        </w:rPr>
+      </w:pPr>
       <w:r>
         <w:rPr>
           <w:rFonts w:hint="eastAsia"/>
@@ -1259,6 +1333,11 @@
       </w:r>
     </w:p>
     <w:p>
+      <w:pPr>
+        <w:rPr>
+          <w:rFonts w:hint="eastAsia"/>
+        </w:rPr>
+      </w:pPr>
       <w:r>
         <w:rPr>
           <w:rFonts w:hint="eastAsia"/>
@@ -1278,6 +1357,11 @@
       <w:proofErr w:type="gramEnd"/>
     </w:p>
     <w:p>
+      <w:pPr>
+        <w:rPr>
+          <w:rFonts w:hint="eastAsia"/>
+        </w:rPr>
+      </w:pPr>
       <w:r>
         <w:rPr>
           <w:rFonts w:hint="eastAsia"/>
@@ -1299,8 +1383,19 @@
         <w:t>-555-010</w:t>
       </w:r>
     </w:p>
-    <w:p/>
-    <w:p>
+    <w:p>
+      <w:pPr>
+        <w:rPr>
+          <w:rFonts w:hint="eastAsia"/>
+        </w:rPr>
+      </w:pPr>
+    </w:p>
+    <w:p>
+      <w:pPr>
+        <w:rPr>
+          <w:rFonts w:hint="eastAsia"/>
+        </w:rPr>
+      </w:pPr>
       <w:r>
         <w:rPr>
           <w:rFonts w:hint="eastAsia"/>
@@ -1308,8 +1403,19 @@
         <w:t>注册完成后再就是更换商店的id了</w:t>
       </w:r>
     </w:p>
-    <w:p/>
-    <w:p>
+    <w:p>
+      <w:pPr>
+        <w:rPr>
+          <w:rFonts w:hint="eastAsia"/>
+        </w:rPr>
+      </w:pPr>
+    </w:p>
+    <w:p>
+      <w:pPr>
+        <w:rPr>
+          <w:rFonts w:hint="eastAsia"/>
+        </w:rPr>
+      </w:pPr>
       <w:r>
         <w:rPr>
           <w:rFonts w:hint="eastAsia"/>
@@ -1335,8 +1441,19 @@
         <w:t>，点击设置主页最上方的个人apple账户，在媒体与购买项目中点击退出登录，然后登录上你新建的美区id就可以了</w:t>
       </w:r>
     </w:p>
-    <w:p/>
-    <w:p>
+    <w:p>
+      <w:pPr>
+        <w:rPr>
+          <w:rFonts w:hint="eastAsia"/>
+        </w:rPr>
+      </w:pPr>
+    </w:p>
+    <w:p>
+      <w:pPr>
+        <w:rPr>
+          <w:rFonts w:hint="eastAsia"/>
+        </w:rPr>
+      </w:pPr>
       <w:r>
         <w:rPr>
           <w:rFonts w:hint="eastAsia"/>
@@ -1352,6 +1469,11 @@
       </w:pPr>
     </w:p>
     <w:p>
+      <w:pPr>
+        <w:rPr>
+          <w:rFonts w:hint="eastAsia"/>
+        </w:rPr>
+      </w:pPr>
       <w:r>
         <w:rPr>
           <w:rFonts w:hint="eastAsia"/>
@@ -1360,6 +1482,11 @@
       </w:r>
     </w:p>
     <w:p>
+      <w:pPr>
+        <w:rPr>
+          <w:rFonts w:hint="eastAsia"/>
+        </w:rPr>
+      </w:pPr>
       <w:r>
         <w:rPr>
           <w:rFonts w:hint="eastAsia"/>
@@ -1374,6 +1501,9 @@
         </w:rPr>
       </w:pPr>
       <w:r>
+        <w:rPr>
+          <w:noProof/>
+        </w:rPr>
         <w:drawing>
           <wp:inline distT="0" distB="0" distL="0" distR="0" wp14:anchorId="4802CA60" wp14:editId="45603057">
             <wp:extent cx="4088130" cy="1828800"/>
@@ -1421,6 +1551,11 @@
       </w:r>
     </w:p>
     <w:p>
+      <w:pPr>
+        <w:rPr>
+          <w:rFonts w:hint="eastAsia"/>
+        </w:rPr>
+      </w:pPr>
       <w:r>
         <w:rPr>
           <w:rFonts w:hint="eastAsia"/>
@@ -1438,6 +1573,9 @@
     <w:p>
       <w:pPr>
         <w:pStyle w:val="2"/>
+        <w:rPr>
+          <w:rFonts w:hint="eastAsia"/>
+        </w:rPr>
       </w:pPr>
       <w:r>
         <w:rPr>
@@ -1452,8 +1590,19 @@
         <w:t>系统</w:t>
       </w:r>
     </w:p>
-    <w:p/>
-    <w:p>
+    <w:p>
+      <w:pPr>
+        <w:rPr>
+          <w:rFonts w:hint="eastAsia"/>
+        </w:rPr>
+      </w:pPr>
+    </w:p>
+    <w:p>
+      <w:pPr>
+        <w:rPr>
+          <w:rFonts w:hint="eastAsia"/>
+        </w:rPr>
+      </w:pPr>
       <w:r>
         <w:rPr>
           <w:rFonts w:hint="eastAsia"/>
@@ -1494,17 +1643,41 @@
         </w:rPr>
         <w:t>格式文件然后传到手机上下载</w:t>
       </w:r>
-      <w:hyperlink r:id="rId14" w:history="1">
-        <w:r>
-          <w:rPr>
-            <w:rStyle w:val="ae"/>
-          </w:rPr>
-          <w:t>https://github.com/MetaCubeX/ClashMetaForAndroid</w:t>
-        </w:r>
-      </w:hyperlink>
-    </w:p>
-    <w:p/>
-    <w:p>
+      <w:r>
+        <w:fldChar w:fldCharType="begin"/>
+      </w:r>
+      <w:r>
+        <w:instrText>HYPERLINK "https://github.com/MetaCubeX/ClashMetaForAndroid"</w:instrText>
+      </w:r>
+      <w:r>
+        <w:rPr>
+          <w:rFonts w:hint="eastAsia"/>
+        </w:rPr>
+        <w:fldChar w:fldCharType="separate"/>
+      </w:r>
+      <w:r>
+        <w:rPr>
+          <w:rStyle w:val="ae"/>
+        </w:rPr>
+        <w:t>https://github.com/MetaCubeX/ClashMetaForAndroid</w:t>
+      </w:r>
+      <w:r>
+        <w:fldChar w:fldCharType="end"/>
+      </w:r>
+    </w:p>
+    <w:p>
+      <w:pPr>
+        <w:rPr>
+          <w:rFonts w:hint="eastAsia"/>
+        </w:rPr>
+      </w:pPr>
+    </w:p>
+    <w:p>
+      <w:pPr>
+        <w:rPr>
+          <w:rFonts w:hint="eastAsia"/>
+        </w:rPr>
+      </w:pPr>
       <w:r>
         <w:rPr>
           <w:rFonts w:hint="eastAsia"/>
@@ -1541,7 +1714,7 @@
                     </pic:cNvPicPr>
                   </pic:nvPicPr>
                   <pic:blipFill>
-                    <a:blip r:embed="rId15">
+                    <a:blip r:embed="rId14">
                       <a:extLst>
                         <a:ext uri="{28A0092B-C50C-407E-A947-70E740481C1C}">
                           <a14:useLocalDpi xmlns:a14="http://schemas.microsoft.com/office/drawing/2010/main" val="0"/>
@@ -1573,8 +1746,19 @@
         </w:drawing>
       </w:r>
     </w:p>
-    <w:p/>
-    <w:p>
+    <w:p>
+      <w:pPr>
+        <w:rPr>
+          <w:rFonts w:hint="eastAsia"/>
+        </w:rPr>
+      </w:pPr>
+    </w:p>
+    <w:p>
+      <w:pPr>
+        <w:rPr>
+          <w:rFonts w:hint="eastAsia"/>
+        </w:rPr>
+      </w:pPr>
       <w:r>
         <w:rPr>
           <w:rFonts w:hint="eastAsia"/>
@@ -1625,7 +1809,7 @@
                     </pic:cNvPicPr>
                   </pic:nvPicPr>
                   <pic:blipFill>
-                    <a:blip r:embed="rId16">
+                    <a:blip r:embed="rId15">
                       <a:extLst>
                         <a:ext uri="{28A0092B-C50C-407E-A947-70E740481C1C}">
                           <a14:useLocalDpi xmlns:a14="http://schemas.microsoft.com/office/drawing/2010/main" val="0"/>
@@ -1658,6 +1842,11 @@
       </w:r>
     </w:p>
     <w:p>
+      <w:pPr>
+        <w:rPr>
+          <w:rFonts w:hint="eastAsia"/>
+        </w:rPr>
+      </w:pPr>
       <w:r>
         <w:rPr>
           <w:rFonts w:hint="eastAsia"/>
@@ -1680,6 +1869,11 @@
       </w:r>
     </w:p>
     <w:p>
+      <w:pPr>
+        <w:rPr>
+          <w:rFonts w:hint="eastAsia"/>
+        </w:rPr>
+      </w:pPr>
       <w:r>
         <w:rPr>
           <w:rFonts w:hint="eastAsia"/>
@@ -1687,7 +1881,13 @@
         <w:t>然后再就是和电脑端一样的使用办法了，没有用电脑的小伙伴可以去看看上面的教程</w:t>
       </w:r>
     </w:p>
-    <w:p/>
+    <w:p>
+      <w:pPr>
+        <w:rPr>
+          <w:rFonts w:hint="eastAsia"/>
+        </w:rPr>
+      </w:pPr>
+    </w:p>
     <w:p>
       <w:pPr>
         <w:rPr>
@@ -1721,24 +1921,42 @@
         <w:lastRenderedPageBreak/>
         <w:t>的使用体验更好</w:t>
       </w:r>
-      <w:hyperlink r:id="rId17" w:history="1">
-        <w:r>
-          <w:rPr>
-            <w:color w:val="0000FF"/>
-            <w:u w:val="single"/>
-          </w:rPr>
-          <w:t>创建您的 Google 账号</w:t>
-        </w:r>
-      </w:hyperlink>
-    </w:p>
-    <w:p>
-      <w:pPr>
-        <w:rPr>
-          <w:rFonts w:hint="eastAsia"/>
-        </w:rPr>
-      </w:pPr>
-    </w:p>
-    <w:p>
+      <w:r>
+        <w:fldChar w:fldCharType="begin"/>
+      </w:r>
+      <w:r>
+        <w:instrText>HYPERLINK "https://accounts.google.com/lifecycle/steps/signup/name?dsh=S1798321278:1793353812157040&amp;flowEntry=SignUp&amp;flowName=GlifWebSignIn&amp;TL=AAxq8nsv9JXQLJjAaG9m0LL66ZZzlnwZHYfw34PApzTcjvtGCfz9FWprAfBjbzX8&amp;continue=https://accounts.google.com/ManageAccount?nc%3D1"</w:instrText>
+      </w:r>
+      <w:r>
+        <w:rPr>
+          <w:rFonts w:hint="eastAsia"/>
+        </w:rPr>
+        <w:fldChar w:fldCharType="separate"/>
+      </w:r>
+      <w:r>
+        <w:rPr>
+          <w:color w:val="0000FF"/>
+          <w:u w:val="single"/>
+        </w:rPr>
+        <w:t>创建您的 Google 账号</w:t>
+      </w:r>
+      <w:r>
+        <w:fldChar w:fldCharType="end"/>
+      </w:r>
+    </w:p>
+    <w:p>
+      <w:pPr>
+        <w:rPr>
+          <w:rFonts w:hint="eastAsia"/>
+        </w:rPr>
+      </w:pPr>
+    </w:p>
+    <w:p>
+      <w:pPr>
+        <w:rPr>
+          <w:rFonts w:hint="eastAsia"/>
+        </w:rPr>
+      </w:pPr>
       <w:r>
         <w:rPr>
           <w:rFonts w:hint="eastAsia"/>
@@ -1753,6 +1971,11 @@
       </w:r>
     </w:p>
     <w:p>
+      <w:pPr>
+        <w:rPr>
+          <w:rFonts w:hint="eastAsia"/>
+        </w:rPr>
+      </w:pPr>
       <w:r>
         <w:rPr>
           <w:rFonts w:hint="eastAsia"/>
@@ -1775,6 +1998,11 @@
       </w:r>
     </w:p>
     <w:p>
+      <w:pPr>
+        <w:rPr>
+          <w:rFonts w:hint="eastAsia"/>
+        </w:rPr>
+      </w:pPr>
       <w:r>
         <w:rPr>
           <w:rFonts w:hint="eastAsia"/>
@@ -1783,7 +2011,12 @@
       </w:r>
     </w:p>
     <w:p>
-      <w:hyperlink r:id="rId18" w:history="1">
+      <w:pPr>
+        <w:rPr>
+          <w:rFonts w:hint="eastAsia"/>
+        </w:rPr>
+      </w:pPr>
+      <w:hyperlink r:id="rId16" w:history="1">
         <w:r>
           <w:rPr>
             <w:rStyle w:val="ae"/>
@@ -1793,7 +2026,12 @@
       </w:hyperlink>
     </w:p>
     <w:p>
-      <w:hyperlink r:id="rId19" w:history="1">
+      <w:pPr>
+        <w:rPr>
+          <w:rFonts w:hint="eastAsia"/>
+        </w:rPr>
+      </w:pPr>
+      <w:hyperlink r:id="rId17" w:history="1">
         <w:r>
           <w:rPr>
             <w:rStyle w:val="ae"/>
@@ -1803,7 +2041,12 @@
       </w:hyperlink>
     </w:p>
     <w:p>
-      <w:hyperlink r:id="rId20" w:history="1">
+      <w:pPr>
+        <w:rPr>
+          <w:rFonts w:hint="eastAsia"/>
+        </w:rPr>
+      </w:pPr>
+      <w:hyperlink r:id="rId18" w:history="1">
         <w:r>
           <w:rPr>
             <w:rStyle w:val="ae"/>
@@ -1811,6 +2054,788 @@
           <w:t>https://gemini.google.com/</w:t>
         </w:r>
       </w:hyperlink>
+    </w:p>
+    <w:p>
+      <w:pPr>
+        <w:rPr>
+          <w:rFonts w:hint="eastAsia"/>
+        </w:rPr>
+      </w:pPr>
+    </w:p>
+    <w:p>
+      <w:pPr>
+        <w:pStyle w:val="1"/>
+        <w:rPr>
+          <w:rFonts w:hint="eastAsia"/>
+        </w:rPr>
+      </w:pPr>
+      <w:r>
+        <w:rPr>
+          <w:rFonts w:hint="eastAsia"/>
+        </w:rPr>
+        <w:t>进阶——办理订阅</w:t>
+      </w:r>
+    </w:p>
+    <w:p>
+      <w:pPr>
+        <w:rPr>
+          <w:rFonts w:hint="eastAsia"/>
+          <w:sz w:val="44"/>
+          <w:szCs w:val="48"/>
+        </w:rPr>
+      </w:pPr>
+      <w:r>
+        <w:rPr>
+          <w:rFonts w:hint="eastAsia"/>
+          <w:sz w:val="44"/>
+          <w:szCs w:val="48"/>
+        </w:rPr>
+        <w:t>仅</w:t>
+      </w:r>
+      <w:proofErr w:type="spellStart"/>
+      <w:r>
+        <w:rPr>
+          <w:rFonts w:hint="eastAsia"/>
+          <w:sz w:val="44"/>
+          <w:szCs w:val="48"/>
+        </w:rPr>
+        <w:t>ios</w:t>
+      </w:r>
+      <w:proofErr w:type="spellEnd"/>
+      <w:r>
+        <w:rPr>
+          <w:rFonts w:hint="eastAsia"/>
+          <w:sz w:val="44"/>
+          <w:szCs w:val="48"/>
+        </w:rPr>
+        <w:t>用户参考</w:t>
+      </w:r>
+    </w:p>
+    <w:p>
+      <w:pPr>
+        <w:rPr>
+          <w:rFonts w:hint="eastAsia"/>
+        </w:rPr>
+      </w:pPr>
+    </w:p>
+    <w:p>
+      <w:pPr>
+        <w:rPr>
+          <w:rStyle w:val="af1"/>
+          <w:rFonts w:hint="eastAsia"/>
+          <w:b w:val="0"/>
+          <w:bCs w:val="0"/>
+        </w:rPr>
+      </w:pPr>
+      <w:r>
+        <w:rPr>
+          <w:rFonts w:hint="eastAsia"/>
+        </w:rPr>
+        <w:t>最后如果你不满足于普通的chat模型想要订阅，</w:t>
+      </w:r>
+      <w:r>
+        <w:rPr>
+          <w:rFonts w:hint="eastAsia"/>
+        </w:rPr>
+        <w:t>还是推荐</w:t>
+      </w:r>
+      <w:r>
+        <w:rPr>
+          <w:rFonts w:hint="eastAsia"/>
+        </w:rPr>
+        <w:t>优先前往银行办理</w:t>
+      </w:r>
+      <w:r>
+        <w:rPr>
+          <w:rStyle w:val="af1"/>
+        </w:rPr>
+        <w:t>万事达卡</w:t>
+      </w:r>
+      <w:r>
+        <w:rPr>
+          <w:rStyle w:val="af1"/>
+          <w:rFonts w:hint="eastAsia"/>
+          <w:b w:val="0"/>
+          <w:bCs w:val="0"/>
+        </w:rPr>
+        <w:t>，关于这个</w:t>
+      </w:r>
+      <w:r>
+        <w:rPr>
+          <w:rStyle w:val="af1"/>
+          <w:rFonts w:hint="eastAsia"/>
+          <w:b w:val="0"/>
+          <w:bCs w:val="0"/>
+        </w:rPr>
+        <w:t>卡的办理各大平台上都有教程我这边就不赘述了</w:t>
+      </w:r>
+    </w:p>
+    <w:p>
+      <w:pPr>
+        <w:rPr>
+          <w:rStyle w:val="af1"/>
+          <w:rFonts w:hint="eastAsia"/>
+          <w:b w:val="0"/>
+          <w:bCs w:val="0"/>
+        </w:rPr>
+      </w:pPr>
+    </w:p>
+    <w:p>
+      <w:pPr>
+        <w:rPr>
+          <w:rStyle w:val="af1"/>
+          <w:rFonts w:hint="eastAsia"/>
+          <w:sz w:val="24"/>
+          <w:szCs w:val="28"/>
+        </w:rPr>
+      </w:pPr>
+      <w:r>
+        <w:rPr>
+          <w:rStyle w:val="af1"/>
+          <w:sz w:val="24"/>
+          <w:szCs w:val="28"/>
+          <w:highlight w:val="yellow"/>
+        </w:rPr>
+        <w:t>中间关于礼品卡的介绍，不需要订阅ai，但想要订阅购买其他不用绑卡的</w:t>
+      </w:r>
+      <w:r>
+        <w:rPr>
+          <w:rStyle w:val="af1"/>
+          <w:rFonts w:hint="eastAsia"/>
+          <w:sz w:val="24"/>
+          <w:szCs w:val="28"/>
+          <w:highlight w:val="yellow"/>
+        </w:rPr>
+        <w:t>美区id应用商店里的</w:t>
+      </w:r>
+      <w:r>
+        <w:rPr>
+          <w:rStyle w:val="af1"/>
+          <w:sz w:val="24"/>
+          <w:szCs w:val="28"/>
+          <w:highlight w:val="yellow"/>
+        </w:rPr>
+        <w:t>商品的小伙伴可以看一下，这个很快</w:t>
+      </w:r>
+    </w:p>
+    <w:p>
+      <w:pPr>
+        <w:rPr>
+          <w:rFonts w:hint="eastAsia"/>
+        </w:rPr>
+      </w:pPr>
+    </w:p>
+    <w:p>
+      <w:pPr>
+        <w:rPr>
+          <w:rFonts w:hint="eastAsia"/>
+        </w:rPr>
+      </w:pPr>
+      <w:r>
+        <w:rPr>
+          <w:rFonts w:hint="eastAsia"/>
+        </w:rPr>
+        <w:t>如果不想办理则可以跳转查看此网站办理一个visa的虚拟卡</w:t>
+      </w:r>
+      <w:r>
+        <w:rPr>
+          <w:rFonts w:hint="eastAsia"/>
+        </w:rPr>
+        <w:t>（</w:t>
+      </w:r>
+      <w:r>
+        <w:rPr>
+          <w:rFonts w:hint="eastAsia"/>
+          <w:highlight w:val="yellow"/>
+        </w:rPr>
+        <w:t>此过程比较繁琐</w:t>
+      </w:r>
+      <w:r>
+        <w:rPr>
+          <w:rFonts w:hint="eastAsia"/>
+        </w:rPr>
+        <w:t>）</w:t>
+      </w:r>
+    </w:p>
+    <w:p>
+      <w:pPr>
+        <w:rPr>
+          <w:rFonts w:hint="eastAsia"/>
+        </w:rPr>
+      </w:pPr>
+    </w:p>
+    <w:p>
+      <w:pPr>
+        <w:rPr>
+          <w:rFonts w:hint="eastAsia"/>
+        </w:rPr>
+      </w:pPr>
+      <w:r>
+        <w:t>cm.setbug.com/</w:t>
+      </w:r>
+      <w:proofErr w:type="spellStart"/>
+      <w:r>
+        <w:t>article?slug</w:t>
+      </w:r>
+      <w:proofErr w:type="spellEnd"/>
+      <w:r>
+        <w:t>=</w:t>
+      </w:r>
+      <w:proofErr w:type="spellStart"/>
+      <w:r>
+        <w:t>kkjc</w:t>
+      </w:r>
+      <w:proofErr w:type="spellEnd"/>
+      <w:r>
+        <w:rPr>
+          <w:rFonts w:hint="eastAsia"/>
+        </w:rPr>
+        <w:t>办理过程需要你准备七十元左右的费用，这个费用后面是不能取出的</w:t>
+      </w:r>
+    </w:p>
+    <w:p>
+      <w:pPr>
+        <w:rPr>
+          <w:rFonts w:hint="eastAsia"/>
+        </w:rPr>
+      </w:pPr>
+    </w:p>
+    <w:p>
+      <w:pPr>
+        <w:rPr>
+          <w:rFonts w:hint="eastAsia"/>
+        </w:rPr>
+      </w:pPr>
+    </w:p>
+    <w:p>
+      <w:pPr>
+        <w:rPr>
+          <w:rFonts w:hint="eastAsia"/>
+        </w:rPr>
+      </w:pPr>
+    </w:p>
+    <w:p>
+      <w:pPr>
+        <w:rPr>
+          <w:rFonts w:hint="eastAsia"/>
+        </w:rPr>
+      </w:pPr>
+      <w:r>
+        <w:rPr>
+          <w:rFonts w:hint="eastAsia"/>
+        </w:rPr>
+        <w:t>办理完后</w:t>
+      </w:r>
+      <w:proofErr w:type="spellStart"/>
+      <w:r>
+        <w:rPr>
+          <w:rFonts w:hint="eastAsia"/>
+        </w:rPr>
+        <w:t>ios</w:t>
+      </w:r>
+      <w:proofErr w:type="spellEnd"/>
+      <w:r>
+        <w:rPr>
+          <w:rFonts w:hint="eastAsia"/>
+        </w:rPr>
+        <w:t>用户可以通过支付宝搜索找到惠出境</w:t>
+      </w:r>
+    </w:p>
+    <w:p>
+      <w:pPr>
+        <w:rPr>
+          <w:rFonts w:hint="eastAsia"/>
+        </w:rPr>
+      </w:pPr>
+      <w:r>
+        <w:rPr>
+          <w:noProof/>
+        </w:rPr>
+        <w:drawing>
+          <wp:inline distT="0" distB="0" distL="0" distR="0" wp14:anchorId="48C9AC8C" wp14:editId="6C190D1B">
+            <wp:extent cx="3371850" cy="3674152"/>
+            <wp:effectExtent l="0" t="0" r="0" b="2540"/>
+            <wp:docPr id="746113781" name="图片 1"/>
+            <wp:cNvGraphicFramePr>
+              <a:graphicFrameLocks xmlns:a="http://schemas.openxmlformats.org/drawingml/2006/main" noChangeAspect="1"/>
+            </wp:cNvGraphicFramePr>
+            <a:graphic xmlns:a="http://schemas.openxmlformats.org/drawingml/2006/main">
+              <a:graphicData uri="http://schemas.openxmlformats.org/drawingml/2006/picture">
+                <pic:pic xmlns:pic="http://schemas.openxmlformats.org/drawingml/2006/picture">
+                  <pic:nvPicPr>
+                    <pic:cNvPr id="746113781" name=""/>
+                    <pic:cNvPicPr/>
+                  </pic:nvPicPr>
+                  <pic:blipFill rotWithShape="1">
+                    <a:blip r:embed="rId19"/>
+                    <a:srcRect l="1" t="6985" r="-1352" b="42076"/>
+                    <a:stretch>
+                      <a:fillRect/>
+                    </a:stretch>
+                  </pic:blipFill>
+                  <pic:spPr bwMode="auto">
+                    <a:xfrm rot="10800000" flipH="1" flipV="1">
+                      <a:off x="0" y="0"/>
+                      <a:ext cx="3557394" cy="3876331"/>
+                    </a:xfrm>
+                    <a:prstGeom prst="rect">
+                      <a:avLst/>
+                    </a:prstGeom>
+                    <a:ln>
+                      <a:noFill/>
+                    </a:ln>
+                    <a:extLst>
+                      <a:ext uri="{53640926-AAD7-44D8-BBD7-CCE9431645EC}">
+                        <a14:shadowObscured xmlns:a14="http://schemas.microsoft.com/office/drawing/2010/main"/>
+                      </a:ext>
+                    </a:extLst>
+                  </pic:spPr>
+                </pic:pic>
+              </a:graphicData>
+            </a:graphic>
+          </wp:inline>
+        </w:drawing>
+      </w:r>
+    </w:p>
+    <w:p>
+      <w:pPr>
+        <w:rPr>
+          <w:rFonts w:hint="eastAsia"/>
+        </w:rPr>
+      </w:pPr>
+      <w:r>
+        <w:rPr>
+          <w:rFonts w:hint="eastAsia"/>
+        </w:rPr>
+        <w:t>进入惠出境首页</w:t>
+      </w:r>
+      <w:r>
+        <w:rPr>
+          <w:rFonts w:hint="eastAsia"/>
+        </w:rPr>
+        <w:t>，左上角全球位置改为纽约或旧金山之类的美国城市</w:t>
+      </w:r>
+    </w:p>
+    <w:p>
+      <w:pPr>
+        <w:rPr>
+          <w:rFonts w:hint="eastAsia"/>
+        </w:rPr>
+      </w:pPr>
+      <w:r>
+        <w:rPr>
+          <w:noProof/>
+        </w:rPr>
+        <w:lastRenderedPageBreak/>
+        <w:drawing>
+          <wp:inline distT="0" distB="0" distL="0" distR="0" wp14:anchorId="196111A7" wp14:editId="3D01B602">
+            <wp:extent cx="4088130" cy="3962400"/>
+            <wp:effectExtent l="0" t="0" r="7620" b="0"/>
+            <wp:docPr id="899057439" name="图片 1"/>
+            <wp:cNvGraphicFramePr>
+              <a:graphicFrameLocks xmlns:a="http://schemas.openxmlformats.org/drawingml/2006/main" noChangeAspect="1"/>
+            </wp:cNvGraphicFramePr>
+            <a:graphic xmlns:a="http://schemas.openxmlformats.org/drawingml/2006/main">
+              <a:graphicData uri="http://schemas.openxmlformats.org/drawingml/2006/picture">
+                <pic:pic xmlns:pic="http://schemas.openxmlformats.org/drawingml/2006/picture">
+                  <pic:nvPicPr>
+                    <pic:cNvPr id="0" name="Picture 1"/>
+                    <pic:cNvPicPr>
+                      <a:picLocks noChangeAspect="1" noChangeArrowheads="1"/>
+                    </pic:cNvPicPr>
+                  </pic:nvPicPr>
+                  <pic:blipFill rotWithShape="1">
+                    <a:blip r:embed="rId20" cstate="print">
+                      <a:extLst>
+                        <a:ext uri="{28A0092B-C50C-407E-A947-70E740481C1C}">
+                          <a14:useLocalDpi xmlns:a14="http://schemas.microsoft.com/office/drawing/2010/main" val="0"/>
+                        </a:ext>
+                      </a:extLst>
+                    </a:blip>
+                    <a:srcRect t="12466" b="42829"/>
+                    <a:stretch>
+                      <a:fillRect/>
+                    </a:stretch>
+                  </pic:blipFill>
+                  <pic:spPr bwMode="auto">
+                    <a:xfrm>
+                      <a:off x="0" y="0"/>
+                      <a:ext cx="4088130" cy="3962400"/>
+                    </a:xfrm>
+                    <a:prstGeom prst="rect">
+                      <a:avLst/>
+                    </a:prstGeom>
+                    <a:noFill/>
+                    <a:ln>
+                      <a:noFill/>
+                    </a:ln>
+                    <a:extLst>
+                      <a:ext uri="{53640926-AAD7-44D8-BBD7-CCE9431645EC}">
+                        <a14:shadowObscured xmlns:a14="http://schemas.microsoft.com/office/drawing/2010/main"/>
+                      </a:ext>
+                    </a:extLst>
+                  </pic:spPr>
+                </pic:pic>
+              </a:graphicData>
+            </a:graphic>
+          </wp:inline>
+        </w:drawing>
+      </w:r>
+    </w:p>
+    <w:p>
+      <w:pPr>
+        <w:rPr>
+          <w:rFonts w:hint="eastAsia"/>
+        </w:rPr>
+      </w:pPr>
+      <w:r>
+        <w:rPr>
+          <w:noProof/>
+        </w:rPr>
+        <w:lastRenderedPageBreak/>
+        <w:drawing>
+          <wp:inline distT="0" distB="0" distL="0" distR="0" wp14:anchorId="3678DE22" wp14:editId="41641D72">
+            <wp:extent cx="4088130" cy="5067300"/>
+            <wp:effectExtent l="0" t="0" r="7620" b="0"/>
+            <wp:docPr id="8742175" name="图片 2"/>
+            <wp:cNvGraphicFramePr>
+              <a:graphicFrameLocks xmlns:a="http://schemas.openxmlformats.org/drawingml/2006/main" noChangeAspect="1"/>
+            </wp:cNvGraphicFramePr>
+            <a:graphic xmlns:a="http://schemas.openxmlformats.org/drawingml/2006/main">
+              <a:graphicData uri="http://schemas.openxmlformats.org/drawingml/2006/picture">
+                <pic:pic xmlns:pic="http://schemas.openxmlformats.org/drawingml/2006/picture">
+                  <pic:nvPicPr>
+                    <pic:cNvPr id="0" name="Picture 3"/>
+                    <pic:cNvPicPr>
+                      <a:picLocks noChangeAspect="1" noChangeArrowheads="1"/>
+                    </pic:cNvPicPr>
+                  </pic:nvPicPr>
+                  <pic:blipFill rotWithShape="1">
+                    <a:blip r:embed="rId21" cstate="print">
+                      <a:extLst>
+                        <a:ext uri="{28A0092B-C50C-407E-A947-70E740481C1C}">
+                          <a14:useLocalDpi xmlns:a14="http://schemas.microsoft.com/office/drawing/2010/main" val="0"/>
+                        </a:ext>
+                      </a:extLst>
+                    </a:blip>
+                    <a:srcRect t="5803" b="37025"/>
+                    <a:stretch>
+                      <a:fillRect/>
+                    </a:stretch>
+                  </pic:blipFill>
+                  <pic:spPr bwMode="auto">
+                    <a:xfrm>
+                      <a:off x="0" y="0"/>
+                      <a:ext cx="4088130" cy="5067300"/>
+                    </a:xfrm>
+                    <a:prstGeom prst="rect">
+                      <a:avLst/>
+                    </a:prstGeom>
+                    <a:noFill/>
+                    <a:ln>
+                      <a:noFill/>
+                    </a:ln>
+                    <a:extLst>
+                      <a:ext uri="{53640926-AAD7-44D8-BBD7-CCE9431645EC}">
+                        <a14:shadowObscured xmlns:a14="http://schemas.microsoft.com/office/drawing/2010/main"/>
+                      </a:ext>
+                    </a:extLst>
+                  </pic:spPr>
+                </pic:pic>
+              </a:graphicData>
+            </a:graphic>
+          </wp:inline>
+        </w:drawing>
+      </w:r>
+    </w:p>
+    <w:p>
+      <w:pPr>
+        <w:rPr>
+          <w:rFonts w:hint="eastAsia"/>
+        </w:rPr>
+      </w:pPr>
+      <w:r>
+        <w:rPr>
+          <w:rFonts w:hint="eastAsia"/>
+        </w:rPr>
+        <w:t>往下翻找到这个活动然后点进去，在点进去的页面最下面的</w:t>
+      </w:r>
+      <w:proofErr w:type="spellStart"/>
+      <w:r>
+        <w:rPr>
+          <w:rFonts w:hint="eastAsia"/>
+        </w:rPr>
+        <w:t>pockyshop</w:t>
+      </w:r>
+      <w:proofErr w:type="spellEnd"/>
+      <w:r>
+        <w:rPr>
+          <w:noProof/>
+        </w:rPr>
+        <w:drawing>
+          <wp:inline distT="0" distB="0" distL="0" distR="0" wp14:anchorId="304F2FF6" wp14:editId="692B4BA4">
+            <wp:extent cx="4088130" cy="2910205"/>
+            <wp:effectExtent l="0" t="0" r="7620" b="4445"/>
+            <wp:docPr id="1482045702" name="图片 3"/>
+            <wp:cNvGraphicFramePr>
+              <a:graphicFrameLocks xmlns:a="http://schemas.openxmlformats.org/drawingml/2006/main" noChangeAspect="1"/>
+            </wp:cNvGraphicFramePr>
+            <a:graphic xmlns:a="http://schemas.openxmlformats.org/drawingml/2006/main">
+              <a:graphicData uri="http://schemas.openxmlformats.org/drawingml/2006/picture">
+                <pic:pic xmlns:pic="http://schemas.openxmlformats.org/drawingml/2006/picture">
+                  <pic:nvPicPr>
+                    <pic:cNvPr id="0" name="Picture 5"/>
+                    <pic:cNvPicPr>
+                      <a:picLocks noChangeAspect="1" noChangeArrowheads="1"/>
+                    </pic:cNvPicPr>
+                  </pic:nvPicPr>
+                  <pic:blipFill rotWithShape="1">
+                    <a:blip r:embed="rId22" cstate="print">
+                      <a:extLst>
+                        <a:ext uri="{28A0092B-C50C-407E-A947-70E740481C1C}">
+                          <a14:useLocalDpi xmlns:a14="http://schemas.microsoft.com/office/drawing/2010/main" val="0"/>
+                        </a:ext>
+                      </a:extLst>
+                    </a:blip>
+                    <a:srcRect t="67166"/>
+                    <a:stretch>
+                      <a:fillRect/>
+                    </a:stretch>
+                  </pic:blipFill>
+                  <pic:spPr bwMode="auto">
+                    <a:xfrm>
+                      <a:off x="0" y="0"/>
+                      <a:ext cx="4088130" cy="2910205"/>
+                    </a:xfrm>
+                    <a:prstGeom prst="rect">
+                      <a:avLst/>
+                    </a:prstGeom>
+                    <a:noFill/>
+                    <a:ln>
+                      <a:noFill/>
+                    </a:ln>
+                    <a:extLst>
+                      <a:ext uri="{53640926-AAD7-44D8-BBD7-CCE9431645EC}">
+                        <a14:shadowObscured xmlns:a14="http://schemas.microsoft.com/office/drawing/2010/main"/>
+                      </a:ext>
+                    </a:extLst>
+                  </pic:spPr>
+                </pic:pic>
+              </a:graphicData>
+            </a:graphic>
+          </wp:inline>
+        </w:drawing>
+      </w:r>
+    </w:p>
+    <w:p>
+      <w:pPr>
+        <w:rPr>
+          <w:rFonts w:hint="eastAsia"/>
+        </w:rPr>
+      </w:pPr>
+    </w:p>
+    <w:p>
+      <w:pPr>
+        <w:rPr>
+          <w:rFonts w:hint="eastAsia"/>
+        </w:rPr>
+      </w:pPr>
+      <w:r>
+        <w:rPr>
+          <w:rFonts w:hint="eastAsia"/>
+        </w:rPr>
+        <w:lastRenderedPageBreak/>
+        <w:t>进入后选择</w:t>
+      </w:r>
+      <w:r>
+        <w:t>App Store &amp; iTunes</w:t>
+      </w:r>
+      <w:r>
+        <w:rPr>
+          <w:rFonts w:hint="eastAsia"/>
+        </w:rPr>
+        <w:t>的礼品卡</w:t>
+      </w:r>
+    </w:p>
+    <w:p>
+      <w:pPr>
+        <w:rPr>
+          <w:rFonts w:hint="eastAsia"/>
+        </w:rPr>
+      </w:pPr>
+      <w:r>
+        <w:rPr>
+          <w:rFonts w:hint="eastAsia"/>
+        </w:rPr>
+        <w:t>选择你需要的充值金额</w:t>
+      </w:r>
+    </w:p>
+    <w:p>
+      <w:pPr>
+        <w:rPr>
+          <w:rFonts w:hint="eastAsia"/>
+        </w:rPr>
+      </w:pPr>
+      <w:r>
+        <w:rPr>
+          <w:rFonts w:hint="eastAsia"/>
+        </w:rPr>
+        <w:t>充好后将获得的礼品卡代兑换码复制</w:t>
+      </w:r>
+    </w:p>
+    <w:p>
+      <w:pPr>
+        <w:rPr>
+          <w:rFonts w:hint="eastAsia"/>
+        </w:rPr>
+      </w:pPr>
+      <w:r>
+        <w:rPr>
+          <w:rFonts w:hint="eastAsia"/>
+        </w:rPr>
+        <w:t>再打开美区id商店右上角的头像，找到</w:t>
+      </w:r>
+      <w:r>
+        <w:rPr>
+          <w:rFonts w:hint="eastAsia"/>
+          <w:highlight w:val="yellow"/>
+        </w:rPr>
+        <w:t>兑换代码</w:t>
+      </w:r>
+      <w:r>
+        <w:rPr>
+          <w:rFonts w:hint="eastAsia"/>
+        </w:rPr>
+        <w:t>，</w:t>
+      </w:r>
+      <w:r>
+        <w:rPr>
+          <w:rFonts w:hint="eastAsia"/>
+        </w:rPr>
+        <w:t>输入刚刚复制的兑换码即可</w:t>
+      </w:r>
+    </w:p>
+    <w:p>
+      <w:pPr>
+        <w:rPr>
+          <w:rFonts w:hint="eastAsia"/>
+        </w:rPr>
+      </w:pPr>
+      <w:r>
+        <w:rPr>
+          <w:noProof/>
+        </w:rPr>
+        <w:drawing>
+          <wp:inline distT="0" distB="0" distL="0" distR="0" wp14:anchorId="6AAF6015" wp14:editId="274AD04A">
+            <wp:extent cx="4088130" cy="4962525"/>
+            <wp:effectExtent l="0" t="0" r="7620" b="9525"/>
+            <wp:docPr id="895180401" name="图片 1"/>
+            <wp:cNvGraphicFramePr>
+              <a:graphicFrameLocks xmlns:a="http://schemas.openxmlformats.org/drawingml/2006/main" noChangeAspect="1"/>
+            </wp:cNvGraphicFramePr>
+            <a:graphic xmlns:a="http://schemas.openxmlformats.org/drawingml/2006/main">
+              <a:graphicData uri="http://schemas.openxmlformats.org/drawingml/2006/picture">
+                <pic:pic xmlns:pic="http://schemas.openxmlformats.org/drawingml/2006/picture">
+                  <pic:nvPicPr>
+                    <pic:cNvPr id="895180401" name=""/>
+                    <pic:cNvPicPr/>
+                  </pic:nvPicPr>
+                  <pic:blipFill rotWithShape="1">
+                    <a:blip r:embed="rId23"/>
+                    <a:srcRect t="22997" b="21013"/>
+                    <a:stretch>
+                      <a:fillRect/>
+                    </a:stretch>
+                  </pic:blipFill>
+                  <pic:spPr bwMode="auto">
+                    <a:xfrm>
+                      <a:off x="0" y="0"/>
+                      <a:ext cx="4088130" cy="4962525"/>
+                    </a:xfrm>
+                    <a:prstGeom prst="rect">
+                      <a:avLst/>
+                    </a:prstGeom>
+                    <a:ln>
+                      <a:noFill/>
+                    </a:ln>
+                    <a:extLst>
+                      <a:ext uri="{53640926-AAD7-44D8-BBD7-CCE9431645EC}">
+                        <a14:shadowObscured xmlns:a14="http://schemas.microsoft.com/office/drawing/2010/main"/>
+                      </a:ext>
+                    </a:extLst>
+                  </pic:spPr>
+                </pic:pic>
+              </a:graphicData>
+            </a:graphic>
+          </wp:inline>
+        </w:drawing>
+      </w:r>
+    </w:p>
+    <w:p>
+      <w:pPr>
+        <w:rPr>
+          <w:rFonts w:hint="eastAsia"/>
+        </w:rPr>
+      </w:pPr>
+    </w:p>
+    <w:p>
+      <w:pPr>
+        <w:rPr>
+          <w:rFonts w:hint="eastAsia"/>
+        </w:rPr>
+      </w:pPr>
+      <w:r>
+        <w:rPr>
+          <w:rFonts w:hint="eastAsia"/>
+        </w:rPr>
+        <w:t>这个余额将可以购买所有美区id商店里的订阅，作为美元使用，但因为订阅ai都需要再绑一个visa卡，所以需要后面的过程</w:t>
+      </w:r>
+    </w:p>
+    <w:p>
+      <w:pPr>
+        <w:rPr>
+          <w:rFonts w:hint="eastAsia"/>
+        </w:rPr>
+      </w:pPr>
+    </w:p>
+    <w:p>
+      <w:pPr>
+        <w:rPr>
+          <w:rFonts w:hint="eastAsia"/>
+        </w:rPr>
+      </w:pPr>
+      <w:r>
+        <w:rPr>
+          <w:rFonts w:hint="eastAsia"/>
+        </w:rPr>
+        <w:t>如果你是看完了虚拟卡教程迟迟不能绑上你的apple账户，推荐在美区应用商店下载一个</w:t>
+      </w:r>
+      <w:proofErr w:type="spellStart"/>
+      <w:r>
+        <w:rPr>
+          <w:rFonts w:hint="eastAsia"/>
+        </w:rPr>
+        <w:t>paypal</w:t>
+      </w:r>
+      <w:proofErr w:type="spellEnd"/>
+      <w:r>
+        <w:rPr>
+          <w:rFonts w:hint="eastAsia"/>
+        </w:rPr>
+        <w:t>，然后将你办理好的虚拟卡绑定在这上面，通过支付宝充值到你美区apple账户的礼品卡的余额</w:t>
+      </w:r>
+      <w:r>
+        <w:rPr>
+          <w:rFonts w:hint="eastAsia"/>
+        </w:rPr>
+        <w:t>，</w:t>
+      </w:r>
+      <w:r>
+        <w:rPr>
+          <w:rFonts w:hint="eastAsia"/>
+        </w:rPr>
+        <w:t>就可以直接去完成支付了</w:t>
+      </w:r>
     </w:p>
     <w:p>
       <w:pPr>
@@ -2435,6 +3460,7 @@
   <w:style w:type="character" w:default="1" w:styleId="a0">
     <w:name w:val="Default Paragraph Font"/>
     <w:uiPriority w:val="1"/>
+    <w:semiHidden/>
     <w:unhideWhenUsed/>
   </w:style>
   <w:style w:type="table" w:default="1" w:styleId="a1">

</xml_diff>